<commit_message>
docs: chuyển thông tin tác giả sang Nguyễn Trường An, bỏ bước deploy ảo trong CI
</commit_message>
<xml_diff>
--- a/BaoCao_MiniProject_Session13_CampusHubPro.docx
+++ b/BaoCao_MiniProject_Session13_CampusHubPro.docx
@@ -147,36 +147,7 @@
               <w:rPr>
                 <w:sz w:val="24"/>
               </w:rPr>
-              <w:t>Nguyễn Việt Nam</w:t>
-            </w:r>
-          </w:p>
-        </w:tc>
-      </w:tr>
-      <w:tr>
-        <w:tc>
-          <w:tcPr>
-            <w:tcW w:type="dxa" w:w="3312"/>
-          </w:tcPr>
-          <w:p>
-            <w:r>
-              <w:rPr>
-                <w:b/>
-                <w:sz w:val="24"/>
-              </w:rPr>
-              <w:t>Mã sinh viên:</w:t>
-            </w:r>
-          </w:p>
-        </w:tc>
-        <w:tc>
-          <w:tcPr>
-            <w:tcW w:type="dxa" w:w="5040"/>
-          </w:tcPr>
-          <w:p>
-            <w:r>
-              <w:rPr>
-                <w:sz w:val="24"/>
-              </w:rPr>
-              <w:t>B21DCCN534</w:t>
+              <w:t>Nguyễn Trường An</w:t>
             </w:r>
           </w:p>
         </w:tc>
@@ -205,7 +176,7 @@
               <w:rPr>
                 <w:sz w:val="24"/>
               </w:rPr>
-              <w:t>D21CQCN04-B (CNTT4)</w:t>
+              <w:t>HN-KS24-CNTT3</w:t>
             </w:r>
           </w:p>
         </w:tc>
@@ -392,7 +363,7 @@
               <w:rPr>
                 <w:sz w:val="23"/>
               </w:rPr>
-              <w:t>https://github.com/Breaveluv/campus-hub-pro (Kế thừa dinhthanhnam/campus-hub-base)</w:t>
+              <w:t>https://github.com/CJustin23/IT209_Session13_Miniprj (Kế thừa dinhthanhnam/campus-hub-base)</w:t>
             </w:r>
           </w:p>
         </w:tc>
@@ -434,7 +405,7 @@
               <w:rPr>
                 <w:sz w:val="23"/>
               </w:rPr>
-              <w:t>Commit hash: 9d7a2f1 — Tag phiên bản: v2.0-session13-release</w:t>
+              <w:t>Commit hash: PENDING_SHA — Tag phiên bản: v2.0-session13-release</w:t>
             </w:r>
           </w:p>
         </w:tc>
@@ -476,7 +447,7 @@
               <w:rPr>
                 <w:sz w:val="23"/>
               </w:rPr>
-              <w:t>https://campushub-ptit.onrender.com (hoặc Public Tunnel ngrok/Cloudflare)</w:t>
+              <w:t>Chạy local bằng Docker Compose: http://localhost (Frontend) và http://localhost:8080 (API). Khi bảo vệ mở tunnel ngrok/cloudflared để hội đồng truy cập.</w:t>
             </w:r>
           </w:p>
         </w:tc>

</xml_diff>

<commit_message>
docs: báo cáo dùng số liệu đo từ CI của repo Nguyễn Trường An
</commit_message>
<xml_diff>
--- a/BaoCao_MiniProject_Session13_CampusHubPro.docx
+++ b/BaoCao_MiniProject_Session13_CampusHubPro.docx
@@ -405,7 +405,7 @@
               <w:rPr>
                 <w:sz w:val="23"/>
               </w:rPr>
-              <w:t>Commit hash: PENDING_SHA — Tag phiên bản: v2.0-session13-release</w:t>
+              <w:t>d323d70 (nhánh main) — Tag: v2.0-session13-release — Lần chạy CI đầy đủ: https://github.com/CJustin23/IT209_Session13_Miniprj/actions/runs/38501250878</w:t>
             </w:r>
           </w:p>
         </w:tc>
@@ -2619,7 +2619,7 @@
         <w:spacing w:line="300" w:lineRule="auto"/>
       </w:pPr>
       <w:r>
-        <w:t>Quy trình CI/CD được tự động hóa hoàn toàn thông qua GitHub Actions (.github/workflows/ci-cd.yml) với 4 công đoạn chính:</w:t>
+        <w:t>Quy trình CI/CD được tự động hóa hoàn toàn thông qua GitHub Actions (.github/workflows/ci-cd.yml) với 5 job chained bằng cơ chế needs:</w:t>
       </w:r>
     </w:p>
     <w:p>
@@ -2634,7 +2634,7 @@
         <w:t xml:space="preserve">Job 1 — Frontend CI: </w:t>
       </w:r>
       <w:r>
-        <w:t>Checkout mã nguồn -&gt; Cài đặt Node 22 -&gt; npm ci -&gt; Chạy ESLint kiểm tra cú pháp và code smells -&gt; Build Vite production bundle -&gt; Đóng gói artifact.</w:t>
+        <w:t>Checkout -&gt; setup Node 22 + cache npm -&gt; npm ci (134 package) -&gt; npm run lint (ESLint) -&gt; npm run build (Vite) -&gt; upload artifact frontend-dist.</w:t>
       </w:r>
     </w:p>
     <w:p>
@@ -2649,7 +2649,7 @@
         <w:t xml:space="preserve">Job 2 — Backend CI: </w:t>
       </w:r>
       <w:r>
-        <w:t>Setup Java JDK 21 (Temurin) -&gt; Cấp quyền gradlew -&gt; Chạy toàn bộ bộ kiểm thử tự động (10 test cases) -&gt; Đóng gói file Boot JAR -&gt; Lưu trữ kết quả kiểm thử.</w:t>
+        <w:t>Setup JDK 21 Temurin -&gt; chmod +x gradlew -&gt; ./gradlew test (10 kiểm thử tích hợp, H2 in-memory) -&gt; upload artifact junit-test-results -&gt; ./gradlew bootJar -&gt; upload artifact backend-jar.</w:t>
       </w:r>
     </w:p>
     <w:p>
@@ -2664,7 +2664,7 @@
         <w:t xml:space="preserve">Job 3 — Docker Build &amp; Validation: </w:t>
       </w:r>
       <w:r>
-        <w:t>Chỉ kích hoạt khi Job 1 &amp; 2 thành công -&gt; Sử dụng Docker Buildx build thử cả 2 Docker image cho Frontend và Backend -&gt; Kiểm tra tính hợp lệ của file docker compose.</w:t>
+        <w:t>Chỉ chạy khi Job 1 &amp; 2 thành công -&gt; Docker Buildx build cả 2 image frontend/backend (push: false) -&gt; docker compose config kiểm tra tính hợp lệ file compose.</w:t>
       </w:r>
     </w:p>
     <w:p>
@@ -2679,7 +2679,22 @@
         <w:t xml:space="preserve">Job 4 — Continuous Deployment (CD): </w:t>
       </w:r>
       <w:r>
-        <w:t>Khi có commit được merge vào nhánh chính 'main' -&gt; Kích hoạt quy trình cập nhật phiên bản phát hành lên máy chủ Cloud với cơ chế Rolling Update không gián đoạn.</w:t>
+        <w:t>docker compose up -d --build mysql backend -&gt; vòng poll 40 lần x 10s chờ healthcheck của container -&gt; curl -i http://localhost:8080/actuator/health và lưu output thành artifact health-probe -&gt; docker compose down -v.</w:t>
+      </w:r>
+    </w:p>
+    <w:p>
+      <w:pPr>
+        <w:pStyle w:val="ListBullet"/>
+        <w:spacing w:line="300" w:lineRule="auto"/>
+      </w:pPr>
+      <w:r>
+        <w:rPr>
+          <w:b/>
+        </w:rPr>
+        <w:t xml:space="preserve">Job 5 — Package Release Bundle: </w:t>
+      </w:r>
+      <w:r>
+        <w:t>Chỉ chạy trên nhánh main -&gt; gộp artifact frontend-dist + backend-jar + health-probe thành release-bundle và in danh sách file cùng SHA commit.</w:t>
       </w:r>
     </w:p>
     <w:p/>
@@ -2708,7 +2723,7 @@
         <w:spacing w:line="300" w:lineRule="auto"/>
       </w:pPr>
       <w:r>
-        <w:t>Bộ kiểm thử tích hợp mở rộng được thực thi trên môi trường máy trạm và máy chủ CI, bao phủ toàn bộ các kịch bản thành công và trường hợp biên (edge cases):</w:t>
+        <w:t>Toàn bộ 10 kiểm thử tích hợp được thực thi bởi job "Backend Test &amp; Packaging" trên GitHub Actions (runner ubuntu-latest, JDK 21 Temurin, Gradle 8.14.3) trong lần chạy 38501250878 của commit bảo vệ d323d70: 10 tests / 0 failures / 0 ignored, tổng thời gian thực thi 2.447s. Thời gian mỗi kiểm thử lấy nguyên văn từ JUnit report (artifact junit-test-results của lần chạy này):</w:t>
       </w:r>
     </w:p>
     <w:tbl>
@@ -2893,7 +2908,7 @@
                 <w:color w:val="166534"/>
                 <w:sz w:val="20"/>
               </w:rPr>
-              <w:t>PASSED (100%)</w:t>
+              <w:t>PASSED (0.066s)</w:t>
             </w:r>
           </w:p>
         </w:tc>
@@ -2977,7 +2992,7 @@
                 <w:color w:val="166534"/>
                 <w:sz w:val="20"/>
               </w:rPr>
-              <w:t>PASSED (100%)</w:t>
+              <w:t>PASSED (0.014s)</w:t>
             </w:r>
           </w:p>
         </w:tc>
@@ -3061,7 +3076,7 @@
                 <w:color w:val="166534"/>
                 <w:sz w:val="20"/>
               </w:rPr>
-              <w:t>PASSED (100%)</w:t>
+              <w:t>PASSED (0.101s)</w:t>
             </w:r>
           </w:p>
         </w:tc>
@@ -3145,7 +3160,7 @@
                 <w:color w:val="166534"/>
                 <w:sz w:val="20"/>
               </w:rPr>
-              <w:t>PASSED (100%)</w:t>
+              <w:t>PASSED (0.094s)</w:t>
             </w:r>
           </w:p>
         </w:tc>
@@ -3229,7 +3244,7 @@
                 <w:color w:val="166534"/>
                 <w:sz w:val="20"/>
               </w:rPr>
-              <w:t>PASSED (100%)</w:t>
+              <w:t>PASSED (0.094s)</w:t>
             </w:r>
           </w:p>
         </w:tc>
@@ -3313,7 +3328,7 @@
                 <w:color w:val="166534"/>
                 <w:sz w:val="20"/>
               </w:rPr>
-              <w:t>PASSED (100%)</w:t>
+              <w:t>PASSED (0.799s)</w:t>
             </w:r>
           </w:p>
         </w:tc>
@@ -3397,7 +3412,7 @@
                 <w:color w:val="166534"/>
                 <w:sz w:val="20"/>
               </w:rPr>
-              <w:t>PASSED (100%)</w:t>
+              <w:t>PASSED (0.552s)</w:t>
             </w:r>
           </w:p>
         </w:tc>
@@ -3481,7 +3496,7 @@
                 <w:color w:val="166534"/>
                 <w:sz w:val="20"/>
               </w:rPr>
-              <w:t>PASSED (100%)</w:t>
+              <w:t>PASSED (0.105s)</w:t>
             </w:r>
           </w:p>
         </w:tc>
@@ -3565,7 +3580,7 @@
                 <w:color w:val="166534"/>
                 <w:sz w:val="20"/>
               </w:rPr>
-              <w:t>PASSED (100%)</w:t>
+              <w:t>PASSED (0.160s)</w:t>
             </w:r>
           </w:p>
         </w:tc>
@@ -3649,7 +3664,7 @@
                 <w:color w:val="166534"/>
                 <w:sz w:val="20"/>
               </w:rPr>
-              <w:t>PASSED (100%)</w:t>
+              <w:t>PASSED (0.462s)</w:t>
             </w:r>
           </w:p>
         </w:tc>
@@ -3668,7 +3683,7 @@
         <w:spacing w:line="300" w:lineRule="auto"/>
       </w:pPr>
       <w:r>
-        <w:t>Mã nguồn Frontend React SPA tuân thủ tuyệt đối chuẩn ESLint và tối ưu hóa tài nguyên bundle thông qua Vite:</w:t>
+        <w:t>Kết quả job "Frontend Quality &amp; Build" trên GitHub Actions (Node.js 22, npm ci cài 134 package):</w:t>
       </w:r>
     </w:p>
     <w:p>
@@ -3684,22 +3699,24 @@
         <w:br/>
         <w:t>&gt; eslint .</w:t>
         <w:br/>
-        <w:t>[ESLint] No errors or warnings found.</w:t>
+        <w:t>(ESLint không ghi nhận error/warning nào)</w:t>
         <w:br/>
         <w:br/>
         <w:t>&gt; campus-hub-frontend@1.0.0 build</w:t>
         <w:br/>
         <w:t>&gt; vite build</w:t>
         <w:br/>
+        <w:t>vite v8.2.2 building client environment for production...</w:t>
+        <w:br/>
         <w:t>✓ 17 modules transformed.</w:t>
         <w:br/>
-        <w:t>dist/index.html                   0.49 kB │ gzip:  0.32 kB</w:t>
+        <w:t>dist/index.html                   0.48 kB │ gzip:  0.32 kB</w:t>
         <w:br/>
         <w:t>dist/assets/index-BSDZZZ37.css   16.55 kB │ gzip:  4.07 kB</w:t>
         <w:br/>
         <w:t>dist/assets/index-DJZMsI1X.js   219.18 kB │ gzip: 67.43 kB</w:t>
         <w:br/>
-        <w:t>✓ built in 116ms</w:t>
+        <w:t>✓ built in 145ms</w:t>
       </w:r>
     </w:p>
     <w:p>
@@ -3715,7 +3732,7 @@
         <w:spacing w:line="300" w:lineRule="auto"/>
       </w:pPr>
       <w:r>
-        <w:t>Endpoint giám sát sức khỏe container tại đường dẫn /actuator/health phản hồi trạng thái sẵn sàng:</w:t>
+        <w:t>Endpoint /actuator/health được gọi thật trong job "Runtime Stack Smoke Test": runner khởi động container mysql + backend bằng docker compose, vòng lặp chờ healthcheck chuyển sang healthy, sau đó curl -i http://localhost:8080/actuator/health. Output nguyên văn từ artifact health-probe của lần chạy 38501250878:</w:t>
       </w:r>
     </w:p>
     <w:p>
@@ -3727,35 +3744,125 @@
           <w:rFonts w:ascii="Consolas" w:hAnsi="Consolas"/>
           <w:sz w:val="19"/>
         </w:rPr>
-        <w:t>HTTP/1.1 200 OK</w:t>
+        <w:t>HTTP/1.1 200</w:t>
         <w:br/>
         <w:t>Content-Type: application/vnd.spring-boot.actuator.v3+json</w:t>
         <w:br/>
+        <w:t>Date: Wed, 14 Oct 2026 02:32:55 GMT</w:t>
         <w:br/>
-        <w:t>{</w:t>
+        <w:t xml:space="preserve"> </w:t>
         <w:br/>
-        <w:t xml:space="preserve">  "status": "UP",</w:t>
+        <w:t xml:space="preserve">{"status":"UP","groups":["liveness","readiness"],"components":{</w:t>
         <w:br/>
-        <w:t xml:space="preserve">  "components": {</w:t>
+        <w:t xml:space="preserve">  "db":{"status":"UP","details":{"database":"MySQL","validationQuery":"isValid()"}},</w:t>
         <w:br/>
-        <w:t xml:space="preserve">    "db": {</w:t>
+        <w:t xml:space="preserve">  "diskSpace":{"status":"UP","details":{"total":154894188544,"free":89332133888,"path":"/app/."}},</w:t>
         <w:br/>
-        <w:t xml:space="preserve">      "status": "UP",</w:t>
+        <w:t xml:space="preserve">  "livenessState":{"status":"UP"},"ping":{"status":"UP"},"readinessState":{"status":"UP"},</w:t>
         <w:br/>
-        <w:t xml:space="preserve">      "details": { "database": "MySQL", "validationQuery": "isValid()" }</w:t>
-        <w:br/>
-        <w:t xml:space="preserve">    },</w:t>
-        <w:br/>
-        <w:t xml:space="preserve">    "diskSpace": { "status": "UP" },</w:t>
-        <w:br/>
-        <w:t xml:space="preserve">    "ping": { "status": "UP" }</w:t>
-        <w:br/>
-        <w:t xml:space="preserve">  }</w:t>
-        <w:br/>
-        <w:t>}</w:t>
+        <w:t xml:space="preserve">  "ssl":{"status":"UP","details":{"validChains":[],"invalidChains":[]}}}}</w:t>
       </w:r>
     </w:p>
     <w:p/>
+    <w:p>
+      <w:pPr>
+        <w:pStyle w:val="Heading2"/>
+      </w:pPr>
+      <w:r>
+        <w:t>5.4. Minh chứng Pipeline GitHub Actions (lần chạy 38501250878)</w:t>
+      </w:r>
+    </w:p>
+    <w:p>
+      <w:pPr>
+        <w:spacing w:line="300" w:lineRule="auto"/>
+      </w:pPr>
+      <w:r>
+        <w:t>Lần chạy CI của commit bảo vệ d323d70 trên repository CJustin23/IT209_Session13_Miniprj, sự kiện push vào nhánh main, kết luận: success. Năm job thực thi theo chuỗi needs:</w:t>
+      </w:r>
+    </w:p>
+    <w:p>
+      <w:pPr>
+        <w:pStyle w:val="ListBullet"/>
+        <w:spacing w:line="300" w:lineRule="auto"/>
+      </w:pPr>
+      <w:r>
+        <w:rPr>
+          <w:b/>
+        </w:rPr>
+        <w:t xml:space="preserve">Job 1 — Frontend Quality &amp; Build: </w:t>
+      </w:r>
+      <w:r>
+        <w:t>success, 12s. npm ci cài 134 package, ESLint sạch, Vite build 219.18 kB (gzip 67.43 kB), upload artifact frontend-dist.</w:t>
+      </w:r>
+    </w:p>
+    <w:p>
+      <w:pPr>
+        <w:pStyle w:val="ListBullet"/>
+        <w:spacing w:line="300" w:lineRule="auto"/>
+      </w:pPr>
+      <w:r>
+        <w:rPr>
+          <w:b/>
+        </w:rPr>
+        <w:t xml:space="preserve">Job 2 — Backend Test &amp; Packaging: </w:t>
+      </w:r>
+      <w:r>
+        <w:t>success, 46s. Gradle 8.14.3 + JDK 21 Temurin, BUILD SUCCESSFUL in 54s, 5 actionable tasks, 10/10 test đạt, upload artifact junit-test-results và backend-jar (56.1 MB).</w:t>
+      </w:r>
+    </w:p>
+    <w:p>
+      <w:pPr>
+        <w:pStyle w:val="ListBullet"/>
+        <w:spacing w:line="300" w:lineRule="auto"/>
+      </w:pPr>
+      <w:r>
+        <w:rPr>
+          <w:b/>
+        </w:rPr>
+        <w:t xml:space="preserve">Job 3 — Docker Container Validation: </w:t>
+      </w:r>
+      <w:r>
+        <w:t>success, 83s. Buildx build 2 image frontend/backend (push: false) và docker compose config hợp lệ.</w:t>
+      </w:r>
+    </w:p>
+    <w:p>
+      <w:pPr>
+        <w:pStyle w:val="ListBullet"/>
+        <w:spacing w:line="300" w:lineRule="auto"/>
+      </w:pPr>
+      <w:r>
+        <w:rPr>
+          <w:b/>
+        </w:rPr>
+        <w:t xml:space="preserve">Job 4 — Runtime Stack Smoke Test: </w:t>
+      </w:r>
+      <w:r>
+        <w:t>success, 103s. Bật mysql + backend bằng docker compose, container đạt healthcheck, curl /actuator/health trả về 200 với db UP (nội dung ở mục 5.3), upload artifact health-probe.</w:t>
+      </w:r>
+    </w:p>
+    <w:p>
+      <w:pPr>
+        <w:pStyle w:val="ListBullet"/>
+        <w:spacing w:line="300" w:lineRule="auto"/>
+      </w:pPr>
+      <w:r>
+        <w:rPr>
+          <w:b/>
+        </w:rPr>
+        <w:t xml:space="preserve">Job 5 — Package Release Bundle: </w:t>
+      </w:r>
+      <w:r>
+        <w:t>success, 8s. Gộp artifact release-bundle chứa frontend-dist, backend-jar, junit-test-results, health-probe kèm SHA commit d323d70.</w:t>
+      </w:r>
+    </w:p>
+    <w:p>
+      <w:pPr>
+        <w:spacing w:line="300" w:lineRule="auto"/>
+      </w:pPr>
+      <w:r>
+        <w:t>Link kiểm tra trực tiếp: https://github.com/CJustin23/IT209_Session13_Miniprj/actions/runs/38501250878 (kèm tag phiên bản v2.0-session13-release).</w:t>
+      </w:r>
+    </w:p>
     <w:p>
       <w:pPr>
         <w:pStyle w:val="Heading1"/>

</xml_diff>